<commit_message>
docs/sales: broaden council brief to UK-born children of migrant parents
The Birmingham cohort includes second-generation children — British,
born here to migrant parents. Reframed the opportunity and challenge
sections (and the header) so the brief covers both newly-arrived learners
and UK-born children: EAL at home, first in family through the UK system,
parents unfamiliar with the curriculum. Disadvantage framed as real even
when the child is UK-born.

Co-Authored-By: Claude Opus 4.8 <noreply@anthropic.com>
Claude-Session: https://claude.ai/code/session_016PCGQbfDRdfeW6pjmsqaoQ
</commit_message>
<xml_diff>
--- a/docs/sales/StudYear-Birmingham-Council-Detailed-Brief.docx
+++ b/docs/sales/StudYear-Birmingham-Council-Detailed-Brief.docx
@@ -176,6 +176,23 @@
               <w:t xml:space="preserve">Migrant, Low-Income &amp; Disadvantaged Families</w:t>
             </w:r>
           </w:p>
+          <w:p>
+            <w:pPr>
+              <w:spacing w:after="0" w:before="5" w:line="200"/>
+              <w:jc w:val="right"/>
+            </w:pPr>
+            <w:r>
+              <w:rPr>
+                <w:rFonts w:ascii="Calibri" w:cs="Calibri" w:eastAsia="Calibri" w:hAnsi="Calibri"/>
+                <w:i/>
+                <w:iCs/>
+                <w:color w:val="9FB0D0"/>
+                <w:sz w:val="14"/>
+                <w:szCs w:val="14"/>
+              </w:rPr>
+              <w:t xml:space="preserve">incl. UK-born children of migrant parents</w:t>
+            </w:r>
+          </w:p>
         </w:tc>
       </w:tr>
     </w:tbl>
@@ -227,7 +244,7 @@
           <w:sz w:val="21"/>
           <w:szCs w:val="21"/>
         </w:rPr>
-        <w:t xml:space="preserve">This briefing explains what StudYear is, how it works, and the specific value it offers children from migrant, low-income and disadvantaged backgrounds, their schools, and the Council — both immediately and over the years that follow.</w:t>
+        <w:t xml:space="preserve">This briefing explains what StudYear is, how it works, and the specific value it offers children from migrant, low-income and disadvantaged backgrounds — whether newly arrived or born here to migrant parents — together with their schools and the Council, both immediately and over the years that follow.</w:t>
       </w:r>
     </w:p>
     <w:p>
@@ -263,7 +280,7 @@
           <w:sz w:val="21"/>
           <w:szCs w:val="21"/>
         </w:rPr>
-        <w:t xml:space="preserve">Disadvantaged children in Birmingham start behind and, without intervention, fall further behind each year. The children of migrant and low-income families face this most sharply: they arrive mid-year and at different stages, move between education systems, and rarely have access to the one thing that reliably closes the gap — high-quality, personalised tuition. That tuition is expensive and unevenly distributed, which is precisely why the gap persists.</w:t>
+        <w:t xml:space="preserve">Disadvantaged children in Birmingham start behind and, without intervention, fall further behind each year. The children of migrant and low-income families face this most sharply. For some, that means arriving mid-year, at different stages, moving between education systems. For many others — born here to migrant parents — it means growing up with English as an additional language at home, being the first in the family to move through the UK system, and parents who want to help but do not know how it works. Both groups share the same missing ingredient: access to the one thing that reliably closes the gap — high-quality, personalised tuition. That tuition is expensive and unevenly distributed, which is precisely why the gap persists.</w:t>
       </w:r>
     </w:p>
     <w:p>
@@ -329,7 +346,37 @@
           <w:sz w:val="21"/>
           <w:szCs w:val="21"/>
         </w:rPr>
-        <w:t xml:space="preserve">a 15-year-old arriving from another country is not a “Year 11” in any simple sense. Standard provision forces one-size-fits-all; these learners need to be met exactly where they are.</w:t>
+        <w:t xml:space="preserve">a young person arriving from another country is not a “Year 11” in any simple sense. Standard provision forces one-size-fits-all; these learners need to be met exactly where they are.</w:t>
+      </w:r>
+    </w:p>
+    <w:p>
+      <w:pPr>
+        <w:pStyle w:val="ListParagraph"/>
+        <w:numPr>
+          <w:ilvl w:val="0"/>
+          <w:numId w:val="2"/>
+        </w:numPr>
+        <w:spacing w:after="60" w:before="16" w:line="258"/>
+      </w:pPr>
+      <w:r>
+        <w:rPr>
+          <w:rFonts w:ascii="Calibri" w:cs="Calibri" w:eastAsia="Calibri" w:hAnsi="Calibri"/>
+          <w:b/>
+          <w:bCs/>
+          <w:color w:val="2E6BC4"/>
+          <w:sz w:val="21"/>
+          <w:szCs w:val="21"/>
+        </w:rPr>
+        <w:t xml:space="preserve">UK-born, but still navigating two worlds — </w:t>
+      </w:r>
+      <w:r>
+        <w:rPr>
+          <w:rFonts w:ascii="Calibri" w:cs="Calibri" w:eastAsia="Calibri" w:hAnsi="Calibri"/>
+          <w:color w:val="20283F"/>
+          <w:sz w:val="21"/>
+          <w:szCs w:val="21"/>
+        </w:rPr>
+        <w:t xml:space="preserve">many of these children are British, born here to migrant parents. They often grow up with English as an additional language at home, are the first in their family to move through the UK system, and cannot draw on a parent who sat these exams. The disadvantage is real even when the accent is local.</w:t>
       </w:r>
     </w:p>
     <w:p>

</xml_diff>

<commit_message>
docs/sales: add Skills Coach to the Birmingham council brief
Two bullets added: a capability line in "What StudYear is" (photograph a
page of handwriting or notes → an ongoing plan for handwriting/spelling/
writing level or memory/retention, items pushed into spaced practice),
and a benefits-for-children line noting it targets the exact literacy and
retention gaps these children face. Branding and structure unchanged.

Co-Authored-By: Claude Opus 4.8 <noreply@anthropic.com>
Claude-Session: https://claude.ai/code/session_016PCGQbfDRdfeW6pjmsqaoQ
</commit_message>
<xml_diff>
--- a/docs/sales/StudYear-Birmingham-Council-Detailed-Brief.docx
+++ b/docs/sales/StudYear-Birmingham-Council-Detailed-Brief.docx
@@ -717,6 +717,36 @@
     </w:p>
     <w:p>
       <w:pPr>
+        <w:pStyle w:val="ListParagraph"/>
+        <w:numPr>
+          <w:ilvl w:val="0"/>
+          <w:numId w:val="2"/>
+        </w:numPr>
+        <w:spacing w:after="60" w:before="16" w:line="258"/>
+      </w:pPr>
+      <w:r>
+        <w:rPr>
+          <w:rFonts w:ascii="Calibri" w:cs="Calibri" w:eastAsia="Calibri" w:hAnsi="Calibri"/>
+          <w:b/>
+          <w:bCs/>
+          <w:color w:val="2E6BC4"/>
+          <w:sz w:val="21"/>
+          <w:szCs w:val="21"/>
+        </w:rPr>
+        <w:t xml:space="preserve">Reads their actual work — </w:t>
+      </w:r>
+      <w:r>
+        <w:rPr>
+          <w:rFonts w:ascii="Calibri" w:cs="Calibri" w:eastAsia="Calibri" w:hAnsi="Calibri"/>
+          <w:color w:val="20283F"/>
+          <w:sz w:val="21"/>
+          <w:szCs w:val="21"/>
+        </w:rPr>
+        <w:t xml:space="preserve">a Skills Coach lets a parent photograph a page of handwriting or a set of notes; the AI reads it closely and builds an ongoing plan — for handwriting, spelling and writing level, or for memory and retention when repeating and copying isn’t working — with the key items pushed into daily spaced practice.</w:t>
+      </w:r>
+    </w:p>
+    <w:p>
+      <w:pPr>
         <w:spacing w:after="90" w:before="220"/>
       </w:pPr>
       <w:r>
@@ -887,6 +917,36 @@
           <w:szCs w:val="21"/>
         </w:rPr>
         <w:t xml:space="preserve">small, well-timed wins and visible progress build the belief that they can succeed — often the missing ingredient.</w:t>
+      </w:r>
+    </w:p>
+    <w:p>
+      <w:pPr>
+        <w:pStyle w:val="ListParagraph"/>
+        <w:numPr>
+          <w:ilvl w:val="0"/>
+          <w:numId w:val="2"/>
+        </w:numPr>
+        <w:spacing w:after="60" w:before="16" w:line="258"/>
+      </w:pPr>
+      <w:r>
+        <w:rPr>
+          <w:rFonts w:ascii="Calibri" w:cs="Calibri" w:eastAsia="Calibri" w:hAnsi="Calibri"/>
+          <w:b/>
+          <w:bCs/>
+          <w:color w:val="2E6BC4"/>
+          <w:sz w:val="21"/>
+          <w:szCs w:val="21"/>
+        </w:rPr>
+        <w:t xml:space="preserve">Targets the real gaps — </w:t>
+      </w:r>
+      <w:r>
+        <w:rPr>
+          <w:rFonts w:ascii="Calibri" w:cs="Calibri" w:eastAsia="Calibri" w:hAnsi="Calibri"/>
+          <w:color w:val="20283F"/>
+          <w:sz w:val="21"/>
+          <w:szCs w:val="21"/>
+        </w:rPr>
+        <w:t xml:space="preserve">the Skills Coach tackles the difficulties these children face most — weak handwriting and spelling, writing below their age, and material that won’t stick — from a single photo, with a quick, trackable plan.</w:t>
       </w:r>
     </w:p>
     <w:p>

</xml_diff>